<commit_message>
Clarify installed skill update workflow
</commit_message>
<xml_diff>
--- a/docs/Инструкция_по_установке_Codex_и_KYC_skill_GitHub.docx
+++ b/docs/Инструкция_по_установке_Codex_и_KYC_skill_GitHub.docx
@@ -483,7 +483,7 @@
             </w:rPr>
             <w:fldChar w:fldCharType="separate"/>
           </w:r>
-          <w:hyperlink w:anchor="_Toc239094385" w:history="1">
+          <w:hyperlink w:anchor="_Toc239094751" w:history="1">
             <w:r>
               <w:rPr>
                 <w:rStyle w:val="a8"/>
@@ -531,7 +531,7 @@
                 <w:noProof/>
                 <w:webHidden/>
               </w:rPr>
-              <w:instrText xml:space="preserve"> PAGEREF _Toc239094385 \h </w:instrText>
+              <w:instrText xml:space="preserve"> PAGEREF _Toc239094751 \h </w:instrText>
             </w:r>
             <w:r>
               <w:rPr>
@@ -581,7 +581,7 @@
               <w:highlight w:val="none"/>
             </w:rPr>
           </w:pPr>
-          <w:hyperlink w:anchor="_Toc239094386" w:history="1">
+          <w:hyperlink w:anchor="_Toc239094752" w:history="1">
             <w:r>
               <w:rPr>
                 <w:rStyle w:val="a8"/>
@@ -629,7 +629,7 @@
                 <w:noProof/>
                 <w:webHidden/>
               </w:rPr>
-              <w:instrText xml:space="preserve"> PAGEREF _Toc239094386 \h </w:instrText>
+              <w:instrText xml:space="preserve"> PAGEREF _Toc239094752 \h </w:instrText>
             </w:r>
             <w:r>
               <w:rPr>
@@ -677,7 +677,7 @@
               <w:highlight w:val="none"/>
             </w:rPr>
           </w:pPr>
-          <w:hyperlink w:anchor="_Toc239094387" w:history="1">
+          <w:hyperlink w:anchor="_Toc239094753" w:history="1">
             <w:r>
               <w:rPr>
                 <w:rStyle w:val="a8"/>
@@ -723,7 +723,7 @@
                 <w:noProof/>
                 <w:webHidden/>
               </w:rPr>
-              <w:instrText xml:space="preserve"> PAGEREF _Toc239094387 \h </w:instrText>
+              <w:instrText xml:space="preserve"> PAGEREF _Toc239094753 \h </w:instrText>
             </w:r>
             <w:r>
               <w:rPr>
@@ -771,7 +771,7 @@
               <w:highlight w:val="none"/>
             </w:rPr>
           </w:pPr>
-          <w:hyperlink w:anchor="_Toc239094388" w:history="1">
+          <w:hyperlink w:anchor="_Toc239094754" w:history="1">
             <w:r>
               <w:rPr>
                 <w:rStyle w:val="a8"/>
@@ -817,7 +817,7 @@
                 <w:noProof/>
                 <w:webHidden/>
               </w:rPr>
-              <w:instrText xml:space="preserve"> PAGEREF _Toc239094388 \h </w:instrText>
+              <w:instrText xml:space="preserve"> PAGEREF _Toc239094754 \h </w:instrText>
             </w:r>
             <w:r>
               <w:rPr>
@@ -867,7 +867,7 @@
               <w:highlight w:val="none"/>
             </w:rPr>
           </w:pPr>
-          <w:hyperlink w:anchor="_Toc239094389" w:history="1">
+          <w:hyperlink w:anchor="_Toc239094755" w:history="1">
             <w:r>
               <w:rPr>
                 <w:rStyle w:val="a8"/>
@@ -915,7 +915,7 @@
                 <w:noProof/>
                 <w:webHidden/>
               </w:rPr>
-              <w:instrText xml:space="preserve"> PAGEREF _Toc239094389 \h </w:instrText>
+              <w:instrText xml:space="preserve"> PAGEREF _Toc239094755 \h </w:instrText>
             </w:r>
             <w:r>
               <w:rPr>
@@ -965,7 +965,7 @@
               <w:highlight w:val="none"/>
             </w:rPr>
           </w:pPr>
-          <w:hyperlink w:anchor="_Toc239094390" w:history="1">
+          <w:hyperlink w:anchor="_Toc239094756" w:history="1">
             <w:r>
               <w:rPr>
                 <w:rStyle w:val="a8"/>
@@ -1013,7 +1013,7 @@
                 <w:noProof/>
                 <w:webHidden/>
               </w:rPr>
-              <w:instrText xml:space="preserve"> PAGEREF _Toc239094390 \h </w:instrText>
+              <w:instrText xml:space="preserve"> PAGEREF _Toc239094756 \h </w:instrText>
             </w:r>
             <w:r>
               <w:rPr>
@@ -1061,7 +1061,7 @@
               <w:highlight w:val="none"/>
             </w:rPr>
           </w:pPr>
-          <w:hyperlink w:anchor="_Toc239094391" w:history="1">
+          <w:hyperlink w:anchor="_Toc239094757" w:history="1">
             <w:r>
               <w:rPr>
                 <w:rStyle w:val="a8"/>
@@ -1107,7 +1107,7 @@
                 <w:noProof/>
                 <w:webHidden/>
               </w:rPr>
-              <w:instrText xml:space="preserve"> PAGEREF _Toc239094391 \h </w:instrText>
+              <w:instrText xml:space="preserve"> PAGEREF _Toc239094757 \h </w:instrText>
             </w:r>
             <w:r>
               <w:rPr>
@@ -1155,7 +1155,7 @@
               <w:highlight w:val="none"/>
             </w:rPr>
           </w:pPr>
-          <w:hyperlink w:anchor="_Toc239094392" w:history="1">
+          <w:hyperlink w:anchor="_Toc239094758" w:history="1">
             <w:r>
               <w:rPr>
                 <w:rStyle w:val="a8"/>
@@ -1201,7 +1201,7 @@
                 <w:noProof/>
                 <w:webHidden/>
               </w:rPr>
-              <w:instrText xml:space="preserve"> PAGEREF _Toc239094392 \h </w:instrText>
+              <w:instrText xml:space="preserve"> PAGEREF _Toc239094758 \h </w:instrText>
             </w:r>
             <w:r>
               <w:rPr>
@@ -1249,7 +1249,7 @@
               <w:highlight w:val="none"/>
             </w:rPr>
           </w:pPr>
-          <w:hyperlink w:anchor="_Toc239094393" w:history="1">
+          <w:hyperlink w:anchor="_Toc239094759" w:history="1">
             <w:r>
               <w:rPr>
                 <w:rStyle w:val="a8"/>
@@ -1295,7 +1295,7 @@
                 <w:noProof/>
                 <w:webHidden/>
               </w:rPr>
-              <w:instrText xml:space="preserve"> PAGEREF _Toc239094393 \h </w:instrText>
+              <w:instrText xml:space="preserve"> PAGEREF _Toc239094759 \h </w:instrText>
             </w:r>
             <w:r>
               <w:rPr>
@@ -1345,7 +1345,7 @@
               <w:highlight w:val="none"/>
             </w:rPr>
           </w:pPr>
-          <w:hyperlink w:anchor="_Toc239094394" w:history="1">
+          <w:hyperlink w:anchor="_Toc239094760" w:history="1">
             <w:r>
               <w:rPr>
                 <w:rStyle w:val="a8"/>
@@ -1393,7 +1393,7 @@
                 <w:noProof/>
                 <w:webHidden/>
               </w:rPr>
-              <w:instrText xml:space="preserve"> PAGEREF _Toc239094394 \h </w:instrText>
+              <w:instrText xml:space="preserve"> PAGEREF _Toc239094760 \h </w:instrText>
             </w:r>
             <w:r>
               <w:rPr>
@@ -1441,7 +1441,7 @@
               <w:highlight w:val="none"/>
             </w:rPr>
           </w:pPr>
-          <w:hyperlink w:anchor="_Toc239094395" w:history="1">
+          <w:hyperlink w:anchor="_Toc239094761" w:history="1">
             <w:r>
               <w:rPr>
                 <w:rStyle w:val="a8"/>
@@ -1487,7 +1487,7 @@
                 <w:noProof/>
                 <w:webHidden/>
               </w:rPr>
-              <w:instrText xml:space="preserve"> PAGEREF _Toc239094395 \h </w:instrText>
+              <w:instrText xml:space="preserve"> PAGEREF _Toc239094761 \h </w:instrText>
             </w:r>
             <w:r>
               <w:rPr>
@@ -1535,7 +1535,7 @@
               <w:highlight w:val="none"/>
             </w:rPr>
           </w:pPr>
-          <w:hyperlink w:anchor="_Toc239094396" w:history="1">
+          <w:hyperlink w:anchor="_Toc239094762" w:history="1">
             <w:r>
               <w:rPr>
                 <w:rStyle w:val="a8"/>
@@ -1581,7 +1581,7 @@
                 <w:noProof/>
                 <w:webHidden/>
               </w:rPr>
-              <w:instrText xml:space="preserve"> PAGEREF _Toc239094396 \h </w:instrText>
+              <w:instrText xml:space="preserve"> PAGEREF _Toc239094762 \h </w:instrText>
             </w:r>
             <w:r>
               <w:rPr>
@@ -1631,7 +1631,7 @@
               <w:highlight w:val="none"/>
             </w:rPr>
           </w:pPr>
-          <w:hyperlink w:anchor="_Toc239094397" w:history="1">
+          <w:hyperlink w:anchor="_Toc239094763" w:history="1">
             <w:r>
               <w:rPr>
                 <w:rStyle w:val="a8"/>
@@ -1679,7 +1679,7 @@
                 <w:noProof/>
                 <w:webHidden/>
               </w:rPr>
-              <w:instrText xml:space="preserve"> PAGEREF _Toc239094397 \h </w:instrText>
+              <w:instrText xml:space="preserve"> PAGEREF _Toc239094763 \h </w:instrText>
             </w:r>
             <w:r>
               <w:rPr>
@@ -1729,7 +1729,7 @@
               <w:highlight w:val="none"/>
             </w:rPr>
           </w:pPr>
-          <w:hyperlink w:anchor="_Toc239094398" w:history="1">
+          <w:hyperlink w:anchor="_Toc239094764" w:history="1">
             <w:r>
               <w:rPr>
                 <w:rStyle w:val="a8"/>
@@ -1777,7 +1777,7 @@
                 <w:noProof/>
                 <w:webHidden/>
               </w:rPr>
-              <w:instrText xml:space="preserve"> PAGEREF _Toc239094398 \h </w:instrText>
+              <w:instrText xml:space="preserve"> PAGEREF _Toc239094764 \h </w:instrText>
             </w:r>
             <w:r>
               <w:rPr>
@@ -1825,7 +1825,7 @@
               <w:highlight w:val="none"/>
             </w:rPr>
           </w:pPr>
-          <w:hyperlink w:anchor="_Toc239094399" w:history="1">
+          <w:hyperlink w:anchor="_Toc239094765" w:history="1">
             <w:r>
               <w:rPr>
                 <w:rStyle w:val="a8"/>
@@ -1871,7 +1871,7 @@
                 <w:noProof/>
                 <w:webHidden/>
               </w:rPr>
-              <w:instrText xml:space="preserve"> PAGEREF _Toc239094399 \h </w:instrText>
+              <w:instrText xml:space="preserve"> PAGEREF _Toc239094765 \h </w:instrText>
             </w:r>
             <w:r>
               <w:rPr>
@@ -1919,7 +1919,7 @@
               <w:highlight w:val="none"/>
             </w:rPr>
           </w:pPr>
-          <w:hyperlink w:anchor="_Toc239094400" w:history="1">
+          <w:hyperlink w:anchor="_Toc239094766" w:history="1">
             <w:r>
               <w:rPr>
                 <w:rStyle w:val="a8"/>
@@ -1965,7 +1965,7 @@
                 <w:noProof/>
                 <w:webHidden/>
               </w:rPr>
-              <w:instrText xml:space="preserve"> PAGEREF _Toc239094400 \h </w:instrText>
+              <w:instrText xml:space="preserve"> PAGEREF _Toc239094766 \h </w:instrText>
             </w:r>
             <w:r>
               <w:rPr>
@@ -2013,7 +2013,7 @@
               <w:highlight w:val="none"/>
             </w:rPr>
           </w:pPr>
-          <w:hyperlink w:anchor="_Toc239094401" w:history="1">
+          <w:hyperlink w:anchor="_Toc239094767" w:history="1">
             <w:r>
               <w:rPr>
                 <w:rStyle w:val="a8"/>
@@ -2059,7 +2059,7 @@
                 <w:noProof/>
                 <w:webHidden/>
               </w:rPr>
-              <w:instrText xml:space="preserve"> PAGEREF _Toc239094401 \h </w:instrText>
+              <w:instrText xml:space="preserve"> PAGEREF _Toc239094767 \h </w:instrText>
             </w:r>
             <w:r>
               <w:rPr>
@@ -2109,7 +2109,7 @@
               <w:highlight w:val="none"/>
             </w:rPr>
           </w:pPr>
-          <w:hyperlink w:anchor="_Toc239094402" w:history="1">
+          <w:hyperlink w:anchor="_Toc239094768" w:history="1">
             <w:r>
               <w:rPr>
                 <w:rStyle w:val="a8"/>
@@ -2157,7 +2157,7 @@
                 <w:noProof/>
                 <w:webHidden/>
               </w:rPr>
-              <w:instrText xml:space="preserve"> PAGEREF _Toc239094402 \h </w:instrText>
+              <w:instrText xml:space="preserve"> PAGEREF _Toc239094768 \h </w:instrText>
             </w:r>
             <w:r>
               <w:rPr>
@@ -2207,7 +2207,7 @@
               <w:highlight w:val="none"/>
             </w:rPr>
           </w:pPr>
-          <w:hyperlink w:anchor="_Toc239094403" w:history="1">
+          <w:hyperlink w:anchor="_Toc239094769" w:history="1">
             <w:r>
               <w:rPr>
                 <w:rStyle w:val="a8"/>
@@ -2255,7 +2255,7 @@
                 <w:noProof/>
                 <w:webHidden/>
               </w:rPr>
-              <w:instrText xml:space="preserve"> PAGEREF _Toc239094403 \h </w:instrText>
+              <w:instrText xml:space="preserve"> PAGEREF _Toc239094769 \h </w:instrText>
             </w:r>
             <w:r>
               <w:rPr>
@@ -2303,7 +2303,7 @@
               <w:highlight w:val="none"/>
             </w:rPr>
           </w:pPr>
-          <w:hyperlink w:anchor="_Toc239094404" w:history="1">
+          <w:hyperlink w:anchor="_Toc239094770" w:history="1">
             <w:r>
               <w:rPr>
                 <w:rStyle w:val="a8"/>
@@ -2349,7 +2349,7 @@
                 <w:noProof/>
                 <w:webHidden/>
               </w:rPr>
-              <w:instrText xml:space="preserve"> PAGEREF _Toc239094404 \h </w:instrText>
+              <w:instrText xml:space="preserve"> PAGEREF _Toc239094770 \h </w:instrText>
             </w:r>
             <w:r>
               <w:rPr>
@@ -2397,7 +2397,7 @@
               <w:highlight w:val="none"/>
             </w:rPr>
           </w:pPr>
-          <w:hyperlink w:anchor="_Toc239094405" w:history="1">
+          <w:hyperlink w:anchor="_Toc239094771" w:history="1">
             <w:r>
               <w:rPr>
                 <w:rStyle w:val="a8"/>
@@ -2443,7 +2443,7 @@
                 <w:noProof/>
                 <w:webHidden/>
               </w:rPr>
-              <w:instrText xml:space="preserve"> PAGEREF _Toc239094405 \h </w:instrText>
+              <w:instrText xml:space="preserve"> PAGEREF _Toc239094771 \h </w:instrText>
             </w:r>
             <w:r>
               <w:rPr>
@@ -2493,7 +2493,7 @@
               <w:highlight w:val="none"/>
             </w:rPr>
           </w:pPr>
-          <w:hyperlink w:anchor="_Toc239094406" w:history="1">
+          <w:hyperlink w:anchor="_Toc239094772" w:history="1">
             <w:r>
               <w:rPr>
                 <w:rStyle w:val="a8"/>
@@ -2541,7 +2541,7 @@
                 <w:noProof/>
                 <w:webHidden/>
               </w:rPr>
-              <w:instrText xml:space="preserve"> PAGEREF _Toc239094406 \h </w:instrText>
+              <w:instrText xml:space="preserve"> PAGEREF _Toc239094772 \h </w:instrText>
             </w:r>
             <w:r>
               <w:rPr>
@@ -2589,7 +2589,7 @@
               <w:highlight w:val="none"/>
             </w:rPr>
           </w:pPr>
-          <w:hyperlink w:anchor="_Toc239094407" w:history="1">
+          <w:hyperlink w:anchor="_Toc239094773" w:history="1">
             <w:r>
               <w:rPr>
                 <w:rStyle w:val="a8"/>
@@ -2635,7 +2635,7 @@
                 <w:noProof/>
                 <w:webHidden/>
               </w:rPr>
-              <w:instrText xml:space="preserve"> PAGEREF _Toc239094407 \h </w:instrText>
+              <w:instrText xml:space="preserve"> PAGEREF _Toc239094773 \h </w:instrText>
             </w:r>
             <w:r>
               <w:rPr>
@@ -2683,7 +2683,7 @@
               <w:highlight w:val="none"/>
             </w:rPr>
           </w:pPr>
-          <w:hyperlink w:anchor="_Toc239094408" w:history="1">
+          <w:hyperlink w:anchor="_Toc239094774" w:history="1">
             <w:r>
               <w:rPr>
                 <w:rStyle w:val="a8"/>
@@ -2729,7 +2729,7 @@
                 <w:noProof/>
                 <w:webHidden/>
               </w:rPr>
-              <w:instrText xml:space="preserve"> PAGEREF _Toc239094408 \h </w:instrText>
+              <w:instrText xml:space="preserve"> PAGEREF _Toc239094774 \h </w:instrText>
             </w:r>
             <w:r>
               <w:rPr>
@@ -2777,7 +2777,7 @@
               <w:highlight w:val="none"/>
             </w:rPr>
           </w:pPr>
-          <w:hyperlink w:anchor="_Toc239094409" w:history="1">
+          <w:hyperlink w:anchor="_Toc239094775" w:history="1">
             <w:r>
               <w:rPr>
                 <w:rStyle w:val="a8"/>
@@ -2823,7 +2823,7 @@
                 <w:noProof/>
                 <w:webHidden/>
               </w:rPr>
-              <w:instrText xml:space="preserve"> PAGEREF _Toc239094409 \h </w:instrText>
+              <w:instrText xml:space="preserve"> PAGEREF _Toc239094775 \h </w:instrText>
             </w:r>
             <w:r>
               <w:rPr>
@@ -2873,7 +2873,7 @@
               <w:highlight w:val="none"/>
             </w:rPr>
           </w:pPr>
-          <w:hyperlink w:anchor="_Toc239094410" w:history="1">
+          <w:hyperlink w:anchor="_Toc239094776" w:history="1">
             <w:r>
               <w:rPr>
                 <w:rStyle w:val="a8"/>
@@ -2921,7 +2921,7 @@
                 <w:noProof/>
                 <w:webHidden/>
               </w:rPr>
-              <w:instrText xml:space="preserve"> PAGEREF _Toc239094410 \h </w:instrText>
+              <w:instrText xml:space="preserve"> PAGEREF _Toc239094776 \h </w:instrText>
             </w:r>
             <w:r>
               <w:rPr>
@@ -2969,7 +2969,7 @@
               <w:highlight w:val="none"/>
             </w:rPr>
           </w:pPr>
-          <w:hyperlink w:anchor="_Toc239094411" w:history="1">
+          <w:hyperlink w:anchor="_Toc239094777" w:history="1">
             <w:r>
               <w:rPr>
                 <w:rStyle w:val="a8"/>
@@ -3015,7 +3015,7 @@
                 <w:noProof/>
                 <w:webHidden/>
               </w:rPr>
-              <w:instrText xml:space="preserve"> PAGEREF _Toc239094411 \h </w:instrText>
+              <w:instrText xml:space="preserve"> PAGEREF _Toc239094777 \h </w:instrText>
             </w:r>
             <w:r>
               <w:rPr>
@@ -3063,7 +3063,7 @@
               <w:highlight w:val="none"/>
             </w:rPr>
           </w:pPr>
-          <w:hyperlink w:anchor="_Toc239094412" w:history="1">
+          <w:hyperlink w:anchor="_Toc239094778" w:history="1">
             <w:r>
               <w:rPr>
                 <w:rStyle w:val="a8"/>
@@ -3109,7 +3109,7 @@
                 <w:noProof/>
                 <w:webHidden/>
               </w:rPr>
-              <w:instrText xml:space="preserve"> PAGEREF _Toc239094412 \h </w:instrText>
+              <w:instrText xml:space="preserve"> PAGEREF _Toc239094778 \h </w:instrText>
             </w:r>
             <w:r>
               <w:rPr>
@@ -3157,7 +3157,7 @@
               <w:highlight w:val="none"/>
             </w:rPr>
           </w:pPr>
-          <w:hyperlink w:anchor="_Toc239094413" w:history="1">
+          <w:hyperlink w:anchor="_Toc239094779" w:history="1">
             <w:r>
               <w:rPr>
                 <w:rStyle w:val="a8"/>
@@ -3203,7 +3203,7 @@
                 <w:noProof/>
                 <w:webHidden/>
               </w:rPr>
-              <w:instrText xml:space="preserve"> PAGEREF _Toc239094413 \h </w:instrText>
+              <w:instrText xml:space="preserve"> PAGEREF _Toc239094779 \h </w:instrText>
             </w:r>
             <w:r>
               <w:rPr>
@@ -3251,7 +3251,7 @@
               <w:highlight w:val="none"/>
             </w:rPr>
           </w:pPr>
-          <w:hyperlink w:anchor="_Toc239094414" w:history="1">
+          <w:hyperlink w:anchor="_Toc239094780" w:history="1">
             <w:r>
               <w:rPr>
                 <w:rStyle w:val="a8"/>
@@ -3297,7 +3297,7 @@
                 <w:noProof/>
                 <w:webHidden/>
               </w:rPr>
-              <w:instrText xml:space="preserve"> PAGEREF _Toc239094414 \h </w:instrText>
+              <w:instrText xml:space="preserve"> PAGEREF _Toc239094780 \h </w:instrText>
             </w:r>
             <w:r>
               <w:rPr>
@@ -3317,7 +3317,7 @@
                 <w:noProof/>
                 <w:webHidden/>
               </w:rPr>
-              <w:t>14</w:t>
+              <w:t>15</w:t>
             </w:r>
             <w:r>
               <w:rPr>
@@ -3345,7 +3345,7 @@
               <w:highlight w:val="none"/>
             </w:rPr>
           </w:pPr>
-          <w:hyperlink w:anchor="_Toc239094415" w:history="1">
+          <w:hyperlink w:anchor="_Toc239094781" w:history="1">
             <w:r>
               <w:rPr>
                 <w:rStyle w:val="a8"/>
@@ -3391,7 +3391,7 @@
                 <w:noProof/>
                 <w:webHidden/>
               </w:rPr>
-              <w:instrText xml:space="preserve"> PAGEREF _Toc239094415 \h </w:instrText>
+              <w:instrText xml:space="preserve"> PAGEREF _Toc239094781 \h </w:instrText>
             </w:r>
             <w:r>
               <w:rPr>
@@ -3441,7 +3441,7 @@
               <w:highlight w:val="none"/>
             </w:rPr>
           </w:pPr>
-          <w:hyperlink w:anchor="_Toc239094416" w:history="1">
+          <w:hyperlink w:anchor="_Toc239094782" w:history="1">
             <w:r>
               <w:rPr>
                 <w:rStyle w:val="a8"/>
@@ -3489,7 +3489,7 @@
                 <w:noProof/>
                 <w:webHidden/>
               </w:rPr>
-              <w:instrText xml:space="preserve"> PAGEREF _Toc239094416 \h </w:instrText>
+              <w:instrText xml:space="preserve"> PAGEREF _Toc239094782 \h </w:instrText>
             </w:r>
             <w:r>
               <w:rPr>
@@ -3539,7 +3539,7 @@
               <w:highlight w:val="none"/>
             </w:rPr>
           </w:pPr>
-          <w:hyperlink w:anchor="_Toc239094417" w:history="1">
+          <w:hyperlink w:anchor="_Toc239094783" w:history="1">
             <w:r>
               <w:rPr>
                 <w:rStyle w:val="a8"/>
@@ -3587,7 +3587,7 @@
                 <w:noProof/>
                 <w:webHidden/>
               </w:rPr>
-              <w:instrText xml:space="preserve"> PAGEREF _Toc239094417 \h </w:instrText>
+              <w:instrText xml:space="preserve"> PAGEREF _Toc239094783 \h </w:instrText>
             </w:r>
             <w:r>
               <w:rPr>
@@ -3607,7 +3607,7 @@
                 <w:noProof/>
                 <w:webHidden/>
               </w:rPr>
-              <w:t>16</w:t>
+              <w:t>17</w:t>
             </w:r>
             <w:r>
               <w:rPr>
@@ -3635,7 +3635,7 @@
               <w:highlight w:val="none"/>
             </w:rPr>
           </w:pPr>
-          <w:hyperlink w:anchor="_Toc239094418" w:history="1">
+          <w:hyperlink w:anchor="_Toc239094784" w:history="1">
             <w:r>
               <w:rPr>
                 <w:rStyle w:val="a8"/>
@@ -3681,7 +3681,7 @@
                 <w:noProof/>
                 <w:webHidden/>
               </w:rPr>
-              <w:instrText xml:space="preserve"> PAGEREF _Toc239094418 \h </w:instrText>
+              <w:instrText xml:space="preserve"> PAGEREF _Toc239094784 \h </w:instrText>
             </w:r>
             <w:r>
               <w:rPr>
@@ -3701,7 +3701,7 @@
                 <w:noProof/>
                 <w:webHidden/>
               </w:rPr>
-              <w:t>16</w:t>
+              <w:t>17</w:t>
             </w:r>
             <w:r>
               <w:rPr>
@@ -3729,7 +3729,7 @@
               <w:highlight w:val="none"/>
             </w:rPr>
           </w:pPr>
-          <w:hyperlink w:anchor="_Toc239094419" w:history="1">
+          <w:hyperlink w:anchor="_Toc239094785" w:history="1">
             <w:r>
               <w:rPr>
                 <w:rStyle w:val="a8"/>
@@ -3775,7 +3775,7 @@
                 <w:noProof/>
                 <w:webHidden/>
               </w:rPr>
-              <w:instrText xml:space="preserve"> PAGEREF _Toc239094419 \h </w:instrText>
+              <w:instrText xml:space="preserve"> PAGEREF _Toc239094785 \h </w:instrText>
             </w:r>
             <w:r>
               <w:rPr>
@@ -3795,7 +3795,7 @@
                 <w:noProof/>
                 <w:webHidden/>
               </w:rPr>
-              <w:t>16</w:t>
+              <w:t>17</w:t>
             </w:r>
             <w:r>
               <w:rPr>
@@ -3823,7 +3823,7 @@
               <w:highlight w:val="none"/>
             </w:rPr>
           </w:pPr>
-          <w:hyperlink w:anchor="_Toc239094420" w:history="1">
+          <w:hyperlink w:anchor="_Toc239094786" w:history="1">
             <w:r>
               <w:rPr>
                 <w:rStyle w:val="a8"/>
@@ -3869,7 +3869,7 @@
                 <w:noProof/>
                 <w:webHidden/>
               </w:rPr>
-              <w:instrText xml:space="preserve"> PAGEREF _Toc239094420 \h </w:instrText>
+              <w:instrText xml:space="preserve"> PAGEREF _Toc239094786 \h </w:instrText>
             </w:r>
             <w:r>
               <w:rPr>
@@ -3889,7 +3889,7 @@
                 <w:noProof/>
                 <w:webHidden/>
               </w:rPr>
-              <w:t>16</w:t>
+              <w:t>17</w:t>
             </w:r>
             <w:r>
               <w:rPr>
@@ -3917,7 +3917,7 @@
               <w:highlight w:val="none"/>
             </w:rPr>
           </w:pPr>
-          <w:hyperlink w:anchor="_Toc239094421" w:history="1">
+          <w:hyperlink w:anchor="_Toc239094787" w:history="1">
             <w:r>
               <w:rPr>
                 <w:rStyle w:val="a8"/>
@@ -3963,7 +3963,7 @@
                 <w:noProof/>
                 <w:webHidden/>
               </w:rPr>
-              <w:instrText xml:space="preserve"> PAGEREF _Toc239094421 \h </w:instrText>
+              <w:instrText xml:space="preserve"> PAGEREF _Toc239094787 \h </w:instrText>
             </w:r>
             <w:r>
               <w:rPr>
@@ -3983,7 +3983,7 @@
                 <w:noProof/>
                 <w:webHidden/>
               </w:rPr>
-              <w:t>17</w:t>
+              <w:t>18</w:t>
             </w:r>
             <w:r>
               <w:rPr>
@@ -4013,7 +4013,7 @@
               <w:highlight w:val="none"/>
             </w:rPr>
           </w:pPr>
-          <w:hyperlink w:anchor="_Toc239094422" w:history="1">
+          <w:hyperlink w:anchor="_Toc239094788" w:history="1">
             <w:r>
               <w:rPr>
                 <w:rStyle w:val="a8"/>
@@ -4061,7 +4061,7 @@
                 <w:noProof/>
                 <w:webHidden/>
               </w:rPr>
-              <w:instrText xml:space="preserve"> PAGEREF _Toc239094422 \h </w:instrText>
+              <w:instrText xml:space="preserve"> PAGEREF _Toc239094788 \h </w:instrText>
             </w:r>
             <w:r>
               <w:rPr>
@@ -4081,7 +4081,7 @@
                 <w:noProof/>
                 <w:webHidden/>
               </w:rPr>
-              <w:t>17</w:t>
+              <w:t>18</w:t>
             </w:r>
             <w:r>
               <w:rPr>
@@ -4149,7 +4149,7 @@
       <w:bookmarkStart w:id="1" w:name="_Toc239092116"/>
       <w:bookmarkStart w:id="2" w:name="_Toc239092142"/>
       <w:bookmarkStart w:id="3" w:name="_Toc239092168"/>
-      <w:bookmarkStart w:id="4" w:name="_Toc239094385"/>
+      <w:bookmarkStart w:id="4" w:name="_Toc239094751"/>
       <w:r>
         <w:rPr>
           <w:color w:val="000000"/>
@@ -4641,7 +4641,7 @@
       <w:bookmarkStart w:id="6" w:name="_Toc239092117"/>
       <w:bookmarkStart w:id="7" w:name="_Toc239092143"/>
       <w:bookmarkStart w:id="8" w:name="_Toc239092169"/>
-      <w:bookmarkStart w:id="9" w:name="_Toc239094386"/>
+      <w:bookmarkStart w:id="9" w:name="_Toc239094752"/>
       <w:r>
         <w:rPr>
           <w:color w:val="000000"/>
@@ -4669,7 +4669,7 @@
       <w:bookmarkStart w:id="11" w:name="_Toc239092118"/>
       <w:bookmarkStart w:id="12" w:name="_Toc239092144"/>
       <w:bookmarkStart w:id="13" w:name="_Toc239092170"/>
-      <w:bookmarkStart w:id="14" w:name="_Toc239094387"/>
+      <w:bookmarkStart w:id="14" w:name="_Toc239094753"/>
       <w:r>
         <w:rPr>
           <w:color w:val="000000"/>
@@ -5269,7 +5269,7 @@
       <w:bookmarkStart w:id="16" w:name="_Toc239092119"/>
       <w:bookmarkStart w:id="17" w:name="_Toc239092145"/>
       <w:bookmarkStart w:id="18" w:name="_Toc239092171"/>
-      <w:bookmarkStart w:id="19" w:name="_Toc239094388"/>
+      <w:bookmarkStart w:id="19" w:name="_Toc239094754"/>
       <w:r>
         <w:rPr>
           <w:color w:val="000000"/>
@@ -5516,7 +5516,7 @@
       <w:bookmarkStart w:id="21" w:name="_Toc239092120"/>
       <w:bookmarkStart w:id="22" w:name="_Toc239092146"/>
       <w:bookmarkStart w:id="23" w:name="_Toc239092172"/>
-      <w:bookmarkStart w:id="24" w:name="_Toc239094389"/>
+      <w:bookmarkStart w:id="24" w:name="_Toc239094755"/>
       <w:r>
         <w:rPr>
           <w:color w:val="000000"/>
@@ -6256,7 +6256,7 @@
       <w:bookmarkStart w:id="26" w:name="_Toc239092121"/>
       <w:bookmarkStart w:id="27" w:name="_Toc239092147"/>
       <w:bookmarkStart w:id="28" w:name="_Toc239092173"/>
-      <w:bookmarkStart w:id="29" w:name="_Toc239094390"/>
+      <w:bookmarkStart w:id="29" w:name="_Toc239094756"/>
       <w:r>
         <w:rPr>
           <w:color w:val="000000"/>
@@ -6300,7 +6300,7 @@
       <w:bookmarkStart w:id="31" w:name="_Toc239092122"/>
       <w:bookmarkStart w:id="32" w:name="_Toc239092148"/>
       <w:bookmarkStart w:id="33" w:name="_Toc239092174"/>
-      <w:bookmarkStart w:id="34" w:name="_Toc239094391"/>
+      <w:bookmarkStart w:id="34" w:name="_Toc239094757"/>
       <w:r>
         <w:rPr>
           <w:color w:val="000000"/>
@@ -6936,7 +6936,7 @@
       <w:bookmarkStart w:id="36" w:name="_Toc239092123"/>
       <w:bookmarkStart w:id="37" w:name="_Toc239092149"/>
       <w:bookmarkStart w:id="38" w:name="_Toc239092175"/>
-      <w:bookmarkStart w:id="39" w:name="_Toc239094392"/>
+      <w:bookmarkStart w:id="39" w:name="_Toc239094758"/>
       <w:r>
         <w:rPr>
           <w:color w:val="000000"/>
@@ -7054,7 +7054,7 @@
         </w:numPr>
         <w:spacing w:before="100" w:after="80"/>
       </w:pPr>
-      <w:bookmarkStart w:id="40" w:name="_Toc239094393"/>
+      <w:bookmarkStart w:id="40" w:name="_Toc239094759"/>
       <w:r>
         <w:rPr>
           <w:color w:val="000000"/>
@@ -7620,7 +7620,7 @@
       <w:bookmarkStart w:id="42" w:name="_Toc239092124"/>
       <w:bookmarkStart w:id="43" w:name="_Toc239092150"/>
       <w:bookmarkStart w:id="44" w:name="_Toc239092176"/>
-      <w:bookmarkStart w:id="45" w:name="_Toc239094394"/>
+      <w:bookmarkStart w:id="45" w:name="_Toc239094760"/>
       <w:r>
         <w:rPr>
           <w:color w:val="000000"/>
@@ -7647,7 +7647,7 @@
       <w:bookmarkStart w:id="47" w:name="_Toc239092125"/>
       <w:bookmarkStart w:id="48" w:name="_Toc239092151"/>
       <w:bookmarkStart w:id="49" w:name="_Toc239092177"/>
-      <w:bookmarkStart w:id="50" w:name="_Toc239094395"/>
+      <w:bookmarkStart w:id="50" w:name="_Toc239094761"/>
       <w:r>
         <w:rPr>
           <w:color w:val="000000"/>
@@ -8018,7 +8018,7 @@
       <w:bookmarkStart w:id="52" w:name="_Toc239092126"/>
       <w:bookmarkStart w:id="53" w:name="_Toc239092152"/>
       <w:bookmarkStart w:id="54" w:name="_Toc239092178"/>
-      <w:bookmarkStart w:id="55" w:name="_Toc239094396"/>
+      <w:bookmarkStart w:id="55" w:name="_Toc239094762"/>
       <w:r>
         <w:rPr>
           <w:color w:val="000000"/>
@@ -8230,7 +8230,7 @@
       <w:bookmarkStart w:id="57" w:name="_Toc239092127"/>
       <w:bookmarkStart w:id="58" w:name="_Toc239092153"/>
       <w:bookmarkStart w:id="59" w:name="_Toc239092179"/>
-      <w:bookmarkStart w:id="60" w:name="_Toc239094397"/>
+      <w:bookmarkStart w:id="60" w:name="_Toc239094763"/>
       <w:r>
         <w:rPr>
           <w:color w:val="000000"/>
@@ -8789,7 +8789,7 @@
       <w:bookmarkStart w:id="62" w:name="_Toc239092128"/>
       <w:bookmarkStart w:id="63" w:name="_Toc239092154"/>
       <w:bookmarkStart w:id="64" w:name="_Toc239092180"/>
-      <w:bookmarkStart w:id="65" w:name="_Toc239094398"/>
+      <w:bookmarkStart w:id="65" w:name="_Toc239094764"/>
       <w:r>
         <w:rPr>
           <w:color w:val="000000"/>
@@ -8817,7 +8817,7 @@
       <w:bookmarkStart w:id="67" w:name="_Toc239092129"/>
       <w:bookmarkStart w:id="68" w:name="_Toc239092155"/>
       <w:bookmarkStart w:id="69" w:name="_Toc239092181"/>
-      <w:bookmarkStart w:id="70" w:name="_Toc239094399"/>
+      <w:bookmarkStart w:id="70" w:name="_Toc239094765"/>
       <w:r>
         <w:rPr>
           <w:color w:val="000000"/>
@@ -8905,7 +8905,7 @@
       <w:bookmarkStart w:id="72" w:name="_Toc239092130"/>
       <w:bookmarkStart w:id="73" w:name="_Toc239092156"/>
       <w:bookmarkStart w:id="74" w:name="_Toc239092182"/>
-      <w:bookmarkStart w:id="75" w:name="_Toc239094400"/>
+      <w:bookmarkStart w:id="75" w:name="_Toc239094766"/>
       <w:r>
         <w:rPr>
           <w:color w:val="000000"/>
@@ -9000,7 +9000,7 @@
       <w:bookmarkStart w:id="77" w:name="_Toc239092131"/>
       <w:bookmarkStart w:id="78" w:name="_Toc239092157"/>
       <w:bookmarkStart w:id="79" w:name="_Toc239092183"/>
-      <w:bookmarkStart w:id="80" w:name="_Toc239094401"/>
+      <w:bookmarkStart w:id="80" w:name="_Toc239094767"/>
       <w:r>
         <w:rPr>
           <w:color w:val="000000"/>
@@ -9515,7 +9515,7 @@
       <w:bookmarkStart w:id="82" w:name="_Toc239092132"/>
       <w:bookmarkStart w:id="83" w:name="_Toc239092158"/>
       <w:bookmarkStart w:id="84" w:name="_Toc239092184"/>
-      <w:bookmarkStart w:id="85" w:name="_Toc239094402"/>
+      <w:bookmarkStart w:id="85" w:name="_Toc239094768"/>
       <w:r>
         <w:rPr>
           <w:color w:val="000000"/>
@@ -10112,7 +10112,7 @@
       <w:bookmarkStart w:id="87" w:name="_Toc239092133"/>
       <w:bookmarkStart w:id="88" w:name="_Toc239092159"/>
       <w:bookmarkStart w:id="89" w:name="_Toc239092185"/>
-      <w:bookmarkStart w:id="90" w:name="_Toc239094403"/>
+      <w:bookmarkStart w:id="90" w:name="_Toc239094769"/>
       <w:r>
         <w:rPr>
           <w:color w:val="000000"/>
@@ -10140,7 +10140,7 @@
       <w:bookmarkStart w:id="92" w:name="_Toc239092134"/>
       <w:bookmarkStart w:id="93" w:name="_Toc239092160"/>
       <w:bookmarkStart w:id="94" w:name="_Toc239092186"/>
-      <w:bookmarkStart w:id="95" w:name="_Toc239094404"/>
+      <w:bookmarkStart w:id="95" w:name="_Toc239094770"/>
       <w:r>
         <w:rPr>
           <w:color w:val="000000"/>
@@ -10829,7 +10829,7 @@
       <w:bookmarkStart w:id="97" w:name="_Toc239092135"/>
       <w:bookmarkStart w:id="98" w:name="_Toc239092161"/>
       <w:bookmarkStart w:id="99" w:name="_Toc239092187"/>
-      <w:bookmarkStart w:id="100" w:name="_Toc239094405"/>
+      <w:bookmarkStart w:id="100" w:name="_Toc239094771"/>
       <w:r>
         <w:rPr>
           <w:color w:val="000000"/>
@@ -11402,7 +11402,7 @@
         </w:numPr>
         <w:spacing w:before="60" w:after="140"/>
       </w:pPr>
-      <w:bookmarkStart w:id="101" w:name="_Toc239094406"/>
+      <w:bookmarkStart w:id="101" w:name="_Toc239094772"/>
       <w:r>
         <w:rPr>
           <w:color w:val="000000"/>
@@ -11496,7 +11496,7 @@
         </w:numPr>
         <w:spacing w:before="100" w:after="80"/>
       </w:pPr>
-      <w:bookmarkStart w:id="102" w:name="_Toc239094407"/>
+      <w:bookmarkStart w:id="102" w:name="_Toc239094773"/>
       <w:r>
         <w:rPr>
           <w:color w:val="000000"/>
@@ -11825,7 +11825,7 @@
         </w:numPr>
         <w:spacing w:before="100" w:after="80"/>
       </w:pPr>
-      <w:bookmarkStart w:id="103" w:name="_Toc239094408"/>
+      <w:bookmarkStart w:id="103" w:name="_Toc239094774"/>
       <w:r>
         <w:rPr>
           <w:color w:val="000000"/>
@@ -12278,7 +12278,7 @@
         </w:numPr>
         <w:spacing w:before="100" w:after="80"/>
       </w:pPr>
-      <w:bookmarkStart w:id="104" w:name="_Toc239094409"/>
+      <w:bookmarkStart w:id="104" w:name="_Toc239094775"/>
       <w:r>
         <w:rPr>
           <w:color w:val="000000"/>
@@ -12479,7 +12479,7 @@
         </w:numPr>
         <w:spacing w:before="60" w:after="140"/>
       </w:pPr>
-      <w:bookmarkStart w:id="105" w:name="_Toc239094410"/>
+      <w:bookmarkStart w:id="105" w:name="_Toc239094776"/>
       <w:r>
         <w:rPr>
           <w:color w:val="000000"/>
@@ -12499,7 +12499,7 @@
         </w:numPr>
         <w:spacing w:before="100" w:after="80"/>
       </w:pPr>
-      <w:bookmarkStart w:id="106" w:name="_Toc239094411"/>
+      <w:bookmarkStart w:id="106" w:name="_Toc239094777"/>
       <w:r>
         <w:rPr>
           <w:color w:val="000000"/>
@@ -12932,7 +12932,7 @@
         </w:numPr>
         <w:spacing w:before="100" w:after="80"/>
       </w:pPr>
-      <w:bookmarkStart w:id="107" w:name="_Toc239094412"/>
+      <w:bookmarkStart w:id="107" w:name="_Toc239094778"/>
       <w:r>
         <w:rPr>
           <w:color w:val="000000"/>
@@ -13477,6 +13477,172 @@
         <w:jc w:val="both"/>
       </w:pPr>
     </w:p>
+    <w:tbl>
+      <w:tblPr>
+        <w:tblW w:w="10560" w:type="dxa"/>
+        <w:jc w:val="center"/>
+        <w:tblBorders>
+          <w:top w:val="single" w:sz="8" w:space="0" w:color="203A78"/>
+          <w:left w:val="single" w:sz="8" w:space="0" w:color="203A78"/>
+          <w:bottom w:val="single" w:sz="8" w:space="0" w:color="203A78"/>
+          <w:right w:val="single" w:sz="8" w:space="0" w:color="203A78"/>
+          <w:insideH w:val="single" w:sz="8" w:space="0" w:color="203A78"/>
+          <w:insideV w:val="single" w:sz="8" w:space="0" w:color="203A78"/>
+        </w:tblBorders>
+        <w:tblLayout w:type="fixed"/>
+        <w:tblLook w:val="04A0" w:firstRow="1" w:lastRow="0" w:firstColumn="1" w:lastColumn="0" w:noHBand="0" w:noVBand="1"/>
+      </w:tblPr>
+      <w:tblGrid>
+        <w:gridCol w:w="10560"/>
+      </w:tblGrid>
+      <w:tr>
+        <w:trPr>
+          <w:jc w:val="center"/>
+        </w:trPr>
+        <w:tc>
+          <w:tcPr>
+            <w:tcW w:w="10065" w:type="dxa"/>
+            <w:shd w:val="clear" w:color="auto" w:fill="EAF0FA"/>
+            <w:tcMar>
+              <w:top w:w="90" w:type="dxa"/>
+              <w:left w:w="110" w:type="dxa"/>
+              <w:bottom w:w="90" w:type="dxa"/>
+              <w:right w:w="110" w:type="dxa"/>
+            </w:tcMar>
+            <w:vAlign w:val="center"/>
+          </w:tcPr>
+          <w:p>
+            <w:pPr>
+              <w:spacing w:after="0" w:line="240" w:lineRule="auto"/>
+            </w:pPr>
+            <w:r>
+              <w:rPr>
+                <w:b/>
+                <w:color w:val="203A78"/>
+                <w:sz w:val="21"/>
+              </w:rPr>
+              <w:t xml:space="preserve">Две локальные копии на этом компьютере. </w:t>
+            </w:r>
+            <w:r>
+              <w:rPr>
+                <w:sz w:val="21"/>
+              </w:rPr>
+              <w:t>GitHub Desktop работает с папкой C:\Users\Варечка\Documents\GitHub\kyc-counterparty-check, а Codex запускает установленную копию из %USERPROFILE%\.cod</w:t>
+            </w:r>
+            <w:r>
+              <w:rPr>
+                <w:sz w:val="21"/>
+              </w:rPr>
+              <w:t>ex\skills\kyc-counterparty-check. После объединения Pull Request обновите установленную копию командами ниже и перезапустите Codex.</w:t>
+            </w:r>
+          </w:p>
+        </w:tc>
+      </w:tr>
+    </w:tbl>
+    <w:p>
+      <w:pPr>
+        <w:spacing w:after="40"/>
+        <w:jc w:val="both"/>
+      </w:pPr>
+    </w:p>
+    <w:p>
+      <w:pPr>
+        <w:keepNext/>
+        <w:spacing w:before="40" w:after="60"/>
+      </w:pPr>
+      <w:r>
+        <w:rPr>
+          <w:b/>
+          <w:sz w:val="21"/>
+        </w:rPr>
+        <w:t>Обновление установленного skill после изменений в GitHub Desktop</w:t>
+      </w:r>
+    </w:p>
+    <w:tbl>
+      <w:tblPr>
+        <w:tblW w:w="10560" w:type="dxa"/>
+        <w:jc w:val="center"/>
+        <w:tblBorders>
+          <w:top w:val="single" w:sz="4" w:space="0" w:color="D9E0EA"/>
+          <w:left w:val="single" w:sz="4" w:space="0" w:color="D9E0EA"/>
+          <w:bottom w:val="single" w:sz="4" w:space="0" w:color="D9E0EA"/>
+          <w:right w:val="single" w:sz="4" w:space="0" w:color="D9E0EA"/>
+          <w:insideH w:val="single" w:sz="4" w:space="0" w:color="D9E0EA"/>
+          <w:insideV w:val="single" w:sz="4" w:space="0" w:color="D9E0EA"/>
+        </w:tblBorders>
+        <w:tblLayout w:type="fixed"/>
+        <w:tblLook w:val="04A0" w:firstRow="1" w:lastRow="0" w:firstColumn="1" w:lastColumn="0" w:noHBand="0" w:noVBand="1"/>
+      </w:tblPr>
+      <w:tblGrid>
+        <w:gridCol w:w="10560"/>
+      </w:tblGrid>
+      <w:tr>
+        <w:trPr>
+          <w:jc w:val="center"/>
+        </w:trPr>
+        <w:tc>
+          <w:tcPr>
+            <w:tcW w:w="10065" w:type="dxa"/>
+            <w:shd w:val="clear" w:color="auto" w:fill="F2F2F2"/>
+            <w:tcMar>
+              <w:top w:w="100" w:type="dxa"/>
+              <w:left w:w="150" w:type="dxa"/>
+              <w:bottom w:w="100" w:type="dxa"/>
+              <w:right w:w="150" w:type="dxa"/>
+            </w:tcMar>
+          </w:tcPr>
+          <w:p>
+            <w:pPr>
+              <w:spacing w:after="0" w:line="240" w:lineRule="auto"/>
+            </w:pPr>
+            <w:r>
+              <w:rPr>
+                <w:rFonts w:ascii="Consolas" w:hAnsi="Consolas" w:cs="Consolas"/>
+                <w:sz w:val="18"/>
+              </w:rPr>
+              <w:t xml:space="preserve">Set-Location </w:t>
+            </w:r>
+            <w:r>
+              <w:rPr>
+                <w:rFonts w:ascii="Consolas" w:hAnsi="Consolas" w:cs="Consolas"/>
+                <w:sz w:val="18"/>
+              </w:rPr>
+              <w:t>"$env:USERPROFILE\.codex\skills\kyc-counterparty-check"</w:t>
+            </w:r>
+          </w:p>
+          <w:p>
+            <w:pPr>
+              <w:spacing w:after="0" w:line="240" w:lineRule="auto"/>
+            </w:pPr>
+            <w:r>
+              <w:rPr>
+                <w:rFonts w:ascii="Consolas" w:hAnsi="Consolas" w:cs="Consolas"/>
+                <w:sz w:val="18"/>
+              </w:rPr>
+              <w:t>git switch main</w:t>
+            </w:r>
+          </w:p>
+          <w:p>
+            <w:pPr>
+              <w:spacing w:after="0" w:line="240" w:lineRule="auto"/>
+            </w:pPr>
+            <w:r>
+              <w:rPr>
+                <w:rFonts w:ascii="Consolas" w:hAnsi="Consolas" w:cs="Consolas"/>
+                <w:sz w:val="18"/>
+              </w:rPr>
+              <w:t>git pull --ff-only</w:t>
+            </w:r>
+          </w:p>
+        </w:tc>
+      </w:tr>
+    </w:tbl>
+    <w:p>
+      <w:pPr>
+        <w:spacing w:after="40"/>
+        <w:jc w:val="both"/>
+      </w:pPr>
+    </w:p>
     <w:p>
       <w:pPr>
         <w:pStyle w:val="2"/>
@@ -13486,7 +13652,7 @@
         </w:numPr>
         <w:spacing w:before="100" w:after="80"/>
       </w:pPr>
-      <w:bookmarkStart w:id="108" w:name="_Toc239094413"/>
+      <w:bookmarkStart w:id="108" w:name="_Toc239094779"/>
       <w:r>
         <w:rPr>
           <w:color w:val="000000"/>
@@ -13574,19 +13740,14 @@
                 <w:rFonts w:ascii="Consolas" w:hAnsi="Consolas" w:cs="Consolas"/>
                 <w:sz w:val="18"/>
               </w:rPr>
-              <w:t>git status</w:t>
-            </w:r>
-          </w:p>
-          <w:p>
-            <w:pPr>
-              <w:spacing w:after="0" w:line="240" w:lineRule="auto"/>
-            </w:pPr>
+              <w:t>git s</w:t>
+            </w:r>
             <w:r>
               <w:rPr>
                 <w:rFonts w:ascii="Consolas" w:hAnsi="Consolas" w:cs="Consolas"/>
                 <w:sz w:val="18"/>
               </w:rPr>
-              <w:t>git diff</w:t>
+              <w:t>tatus</w:t>
             </w:r>
           </w:p>
           <w:p>
@@ -13598,7 +13759,7 @@
                 <w:rFonts w:ascii="Consolas" w:hAnsi="Consolas" w:cs="Consolas"/>
                 <w:sz w:val="18"/>
               </w:rPr>
-              <w:t>git add .</w:t>
+              <w:t>git diff</w:t>
             </w:r>
           </w:p>
           <w:p>
@@ -13610,6 +13771,19 @@
                 <w:rFonts w:ascii="Consolas" w:hAnsi="Consolas" w:cs="Consolas"/>
                 <w:sz w:val="18"/>
               </w:rPr>
+              <w:t>git add .</w:t>
+            </w:r>
+          </w:p>
+          <w:p>
+            <w:pPr>
+              <w:spacing w:after="0" w:line="240" w:lineRule="auto"/>
+            </w:pPr>
+            <w:r>
+              <w:rPr>
+                <w:rFonts w:ascii="Consolas" w:hAnsi="Consolas" w:cs="Consolas"/>
+                <w:sz w:val="18"/>
+              </w:rPr>
+              <w:lastRenderedPageBreak/>
               <w:t>git commit -m "Кратко опишите изменение"</w:t>
             </w:r>
           </w:p>
@@ -13655,7 +13829,7 @@
         </w:numPr>
         <w:spacing w:before="100" w:after="80"/>
       </w:pPr>
-      <w:bookmarkStart w:id="109" w:name="_Toc239094414"/>
+      <w:bookmarkStart w:id="109" w:name="_Toc239094780"/>
       <w:r>
         <w:rPr>
           <w:color w:val="000000"/>
@@ -13707,14 +13881,7 @@
                 <w:rFonts w:ascii="Consolas" w:hAnsi="Consolas" w:cs="Consolas"/>
                 <w:sz w:val="18"/>
               </w:rPr>
-              <w:t xml:space="preserve">$skill-creator Обнови skill </w:t>
-            </w:r>
-            <w:r>
-              <w:rPr>
-                <w:rFonts w:ascii="Consolas" w:hAnsi="Consolas" w:cs="Consolas"/>
-                <w:sz w:val="18"/>
-              </w:rPr>
-              <w:t>kyc-counterparty-check в открытом репозитории. Требование: [одно конкретное изменение]. Не меняй остальные правила. Проверь структуру skill и тестовые сценарии. Не выполняй commit и push, пока я не проверю изменения.</w:t>
+              <w:t>$skill-creator Обнови skill kyc-counterparty-check в открытом репозитории. Требование: [одно конкретное изменение]. Не меняй остальные правила. Проверь структуру skill и тестовые сценарии. Не выполняй commit и push, пока я не проверю изменения.</w:t>
             </w:r>
           </w:p>
         </w:tc>
@@ -13737,20 +13904,21 @@
           <w:color w:val="203A78"/>
           <w:sz w:val="22"/>
         </w:rPr>
-        <w:lastRenderedPageBreak/>
-        <w:t xml:space="preserve">Перед коммитом проверьте: </w:t>
+        <w:t>Перед ком</w:t>
       </w:r>
       <w:r>
         <w:rPr>
+          <w:b/>
+          <w:color w:val="203A78"/>
           <w:sz w:val="22"/>
         </w:rPr>
-        <w:t>git status,</w:t>
+        <w:t xml:space="preserve">митом проверьте: </w:t>
       </w:r>
       <w:r>
         <w:rPr>
           <w:sz w:val="22"/>
         </w:rPr>
-        <w:t xml:space="preserve"> git diff, отсутствие реальных документов и отчётов, успешную проверку структуры skill и тест на синтетическом примере.</w:t>
+        <w:t>git status, git diff, отсутствие реальных документов и отчётов, успешную проверку структуры skill и тест на синтетическом примере.</w:t>
       </w:r>
     </w:p>
     <w:p>
@@ -13762,7 +13930,7 @@
         </w:numPr>
         <w:spacing w:before="100" w:after="80"/>
       </w:pPr>
-      <w:bookmarkStart w:id="110" w:name="_Toc239094415"/>
+      <w:bookmarkStart w:id="110" w:name="_Toc239094781"/>
       <w:r>
         <w:rPr>
           <w:color w:val="000000"/>
@@ -13859,13 +14027,13 @@
         <w:rPr>
           <w:sz w:val="22"/>
         </w:rPr>
-        <w:t>Если после объединения обнаружена оши</w:t>
+        <w:t>Если посл</w:t>
       </w:r>
       <w:r>
         <w:rPr>
           <w:sz w:val="22"/>
         </w:rPr>
-        <w:t>бка, откройте ошибочный коммит или Pull Request на GitHub и используйте Revert. Это создаст новый обратный коммит и сохранит историю. Не применяйте git reset --hard без резервной копии и понимания последствий.</w:t>
+        <w:t>е объединения обнаружена ошибка, откройте ошибочный коммит или Pull Request на GitHub и используйте Revert. Это создаст новый обратный коммит и сохранит историю. Не применяйте git reset --hard без резервной копии и понимания последствий.</w:t>
       </w:r>
     </w:p>
     <w:tbl>
@@ -13918,13 +14086,7 @@
               <w:rPr>
                 <w:sz w:val="21"/>
               </w:rPr>
-              <w:t xml:space="preserve">GitHub хранит версии DOCX и </w:t>
-            </w:r>
-            <w:r>
-              <w:rPr>
-                <w:sz w:val="21"/>
-              </w:rPr>
-              <w:t>PDF, но не показывает удобное построчное сравнение. Перед коммитом откройте обновлённый файл локально, а после push скачайте его из GitHub и проверьте ещё раз.</w:t>
+              <w:t>GitHub хранит версии DOCX и PDF, но не показывает удобное построчное сравнение. Перед коммитом откройте обновлённый файл локально, а после push скачайте его из GitHub и проверьте ещё раз.</w:t>
             </w:r>
           </w:p>
         </w:tc>
@@ -13949,7 +14111,7 @@
       <w:bookmarkStart w:id="112" w:name="_Toc239092136"/>
       <w:bookmarkStart w:id="113" w:name="_Toc239092162"/>
       <w:bookmarkStart w:id="114" w:name="_Toc239092188"/>
-      <w:bookmarkStart w:id="115" w:name="_Toc239094416"/>
+      <w:bookmarkStart w:id="115" w:name="_Toc239094782"/>
       <w:r>
         <w:rPr>
           <w:color w:val="000000"/>
@@ -14561,6 +14723,7 @@
                 <w:color w:val="203A78"/>
                 <w:sz w:val="21"/>
               </w:rPr>
+              <w:lastRenderedPageBreak/>
               <w:t>GitHub просит войти</w:t>
             </w:r>
           </w:p>
@@ -14796,7 +14959,7 @@
       <w:bookmarkStart w:id="117" w:name="_Toc239092137"/>
       <w:bookmarkStart w:id="118" w:name="_Toc239092163"/>
       <w:bookmarkStart w:id="119" w:name="_Toc239092189"/>
-      <w:bookmarkStart w:id="120" w:name="_Toc239094417"/>
+      <w:bookmarkStart w:id="120" w:name="_Toc239094783"/>
       <w:r>
         <w:rPr>
           <w:color w:val="000000"/>
@@ -14824,7 +14987,7 @@
       <w:bookmarkStart w:id="122" w:name="_Toc239092138"/>
       <w:bookmarkStart w:id="123" w:name="_Toc239092164"/>
       <w:bookmarkStart w:id="124" w:name="_Toc239092190"/>
-      <w:bookmarkStart w:id="125" w:name="_Toc239094418"/>
+      <w:bookmarkStart w:id="125" w:name="_Toc239094784"/>
       <w:r>
         <w:rPr>
           <w:color w:val="000000"/>
@@ -15312,7 +15475,7 @@
       <w:bookmarkStart w:id="127" w:name="_Toc239092139"/>
       <w:bookmarkStart w:id="128" w:name="_Toc239092165"/>
       <w:bookmarkStart w:id="129" w:name="_Toc239092191"/>
-      <w:bookmarkStart w:id="130" w:name="_Toc239094419"/>
+      <w:bookmarkStart w:id="130" w:name="_Toc239094785"/>
       <w:r>
         <w:rPr>
           <w:color w:val="000000"/>
@@ -15739,7 +15902,7 @@
       <w:bookmarkStart w:id="132" w:name="_Toc239092140"/>
       <w:bookmarkStart w:id="133" w:name="_Toc239092166"/>
       <w:bookmarkStart w:id="134" w:name="_Toc239092192"/>
-      <w:bookmarkStart w:id="135" w:name="_Toc239094420"/>
+      <w:bookmarkStart w:id="135" w:name="_Toc239094786"/>
       <w:r>
         <w:rPr>
           <w:color w:val="000000"/>
@@ -16114,7 +16277,7 @@
         </w:numPr>
         <w:spacing w:before="100" w:after="80"/>
       </w:pPr>
-      <w:bookmarkStart w:id="136" w:name="_Toc239094421"/>
+      <w:bookmarkStart w:id="136" w:name="_Toc239094787"/>
       <w:r>
         <w:rPr>
           <w:color w:val="000000"/>
@@ -16552,7 +16715,7 @@
       <w:bookmarkStart w:id="138" w:name="_Toc239092141"/>
       <w:bookmarkStart w:id="139" w:name="_Toc239092167"/>
       <w:bookmarkStart w:id="140" w:name="_Toc239092193"/>
-      <w:bookmarkStart w:id="141" w:name="_Toc239094422"/>
+      <w:bookmarkStart w:id="141" w:name="_Toc239094788"/>
       <w:r>
         <w:rPr>
           <w:color w:val="000000"/>
@@ -16822,7 +16985,7 @@
         <w:noProof/>
       </w:rPr>
       <w:drawing>
-        <wp:inline distT="0" distB="0" distL="0" distR="0" wp14:anchorId="211587C0" wp14:editId="52058905">
+        <wp:inline distT="0" distB="0" distL="0" distR="0" wp14:anchorId="215B30F8" wp14:editId="42727090">
           <wp:extent cx="2148840" cy="679334"/>
           <wp:effectExtent l="0" t="0" r="0" b="0"/>
           <wp:docPr id="1" name="Picture 1"/>
@@ -16907,7 +17070,7 @@
         <w:szCs w:val="20"/>
       </w:rPr>
       <w:drawing>
-        <wp:inline distT="0" distB="0" distL="0" distR="0" wp14:anchorId="39666E77" wp14:editId="29A8A96B">
+        <wp:inline distT="0" distB="0" distL="0" distR="0" wp14:anchorId="3B550F51" wp14:editId="49396972">
           <wp:extent cx="2160000" cy="630720"/>
           <wp:effectExtent l="0" t="0" r="0" b="0"/>
           <wp:docPr id="8" name="image1.png"/>

</xml_diff>